<commit_message>
Admin fix, estimates wording, fetch job, mobile UI
</commit_message>
<xml_diff>
--- a/docs/Agahi_Model_Guide.docx
+++ b/docs/Agahi_Model_Guide.docx
@@ -1562,7 +1562,7 @@
     </w:p>
     <w:p>
       <w:r>
-        <w:t>Ranges come from split-conformal calibration: we look at how wrong the chosen model was in earlier test blocks and widen the forecast by the 10th and 90th percentile of those errors. So the range is meant to contain the real price about 8 times in 10. Each test block is calibrated only on earlier blocks.</w:t>
+        <w:t>Ranges come from split-conformal calibration: we look at how wrong the chosen model was in earlier test blocks and widen the forecast by percentiles of those errors. The wide range (10th to 90th percentile, the 80% range) is meant to contain the real price about 8 times in 10; it stays in the admin. Farmers see the shorter likely range (25th to 75th percentile, the 50% range), which is right about half the time. It is calibrated the same way, never shrunk by hand, kept above zero and within the crop's lowest and highest price for that time of year, rounded to the nearest Rs5, and never wider than the 80% range. Both coverages are measured in the backtest and shown on the Models page. Each test block is calibrated only on earlier blocks.</w:t>
       </w:r>
     </w:p>
     <w:p>
@@ -1573,7 +1573,7 @@
         <w:rPr>
           <w:color w:val="1F3B29"/>
         </w:rPr>
-        <w:t>Status rules and how to read them</w:t>
+        <w:t>Status rules (internal) and what farmers read</w:t>
       </w:r>
     </w:p>
     <w:tbl>
@@ -1680,7 +1680,7 @@
               <w:rPr>
                 <w:sz w:val="19"/>
               </w:rPr>
-              <w:t>Good past record, but still a guess.</w:t>
+              <w:t>Likely Rs.. to Rs.. per kg. Rough estimate.</w:t>
             </w:r>
           </w:p>
         </w:tc>
@@ -1724,7 +1724,7 @@
               <w:rPr>
                 <w:sz w:val="19"/>
               </w:rPr>
-              <w:t>Rough guess, not sure.</w:t>
+              <w:t>Likely Rs.. to Rs.. per kg. Rough estimate.</w:t>
             </w:r>
           </w:p>
         </w:tc>
@@ -1768,7 +1768,7 @@
               <w:rPr>
                 <w:sz w:val="19"/>
               </w:rPr>
-              <w:t>Same time last years: Rs.. to Rs.. This is not a forecast.</w:t>
+              <w:t>Likely Rs.. to Rs.. per kg. Rough estimate from past years.</w:t>
             </w:r>
           </w:p>
         </w:tc>
@@ -1812,7 +1812,7 @@
               <w:rPr>
                 <w:sz w:val="19"/>
               </w:rPr>
-              <w:t>No forecast we can trust yet.</w:t>
+              <w:t>No estimate for this yet.</w:t>
             </w:r>
           </w:p>
         </w:tc>
@@ -1821,7 +1821,7 @@
     <w:p/>
     <w:p>
       <w:r>
-        <w:t>Months 1 to 3 can never be reliable: there are just over three years of prices, so they are labelled as rough seasonal guesses. The sell or keep tip only uses 7 or 14 day forecasts that are reliable; otherwise it uses this week's price trend and tomorrow's rain at the farmer's district, and says there is no forecast to trust.</w:t>
+        <w:t>The statuses stay internal: they decide what is shown and are reported on the Models page. Farmers always read "rough estimate" for prices and "estimated" for weather. Months 1 to 3 can never be reliable: there are just over three years of prices, so they read "rough estimate from past seasons". The sell or keep tip only uses 7 or 14 day forecasts that are reliable inside the system; otherwise it uses this week's price trend and tomorrow's rain at the farmer's district, and says it is based on this week's prices. Its wording also says rough estimate.</w:t>
       </w:r>
     </w:p>
     <w:p>
@@ -1939,7 +1939,7 @@
               <w:rPr>
                 <w:sz w:val="19"/>
               </w:rPr>
-              <w:t>Rain total, the wettest day, daytime temperature. If the internet is down: past-years averages, labelled.</w:t>
+              <w:t>Rain total, the wettest day, daytime temperature, all marked (estimated). If the internet is down: past-years averages, labelled estimated.</w:t>
             </w:r>
           </w:p>
         </w:tc>
@@ -1983,7 +1983,7 @@
               <w:rPr>
                 <w:sz w:val="19"/>
               </w:rPr>
-              <w:t>Usual weekly rain range, labelled "from past years, not a forecast" unless a model passed.</w:t>
+              <w:t>Usual weekly rain range, marked (estimated) and "estimated from past years" unless a model passed.</w:t>
             </w:r>
           </w:p>
         </w:tc>
@@ -2027,7 +2027,7 @@
               <w:rPr>
                 <w:sz w:val="19"/>
               </w:rPr>
-              <w:t>Usual rain and whether the last 30 days were wetter or drier than usual.</w:t>
+              <w:t>Usual rain, marked (estimated), and whether the last 30 days were wetter or drier than usual.</w:t>
             </w:r>
           </w:p>
         </w:tc>
@@ -2576,7 +2576,7 @@
               <w:rPr>
                 <w:sz w:val="19"/>
               </w:rPr>
-              <w:t>Change from today, P10/P50/P90</w:t>
+              <w:t>Change from today, P10/P25/P50/P75/P90</w:t>
             </w:r>
           </w:p>
         </w:tc>
@@ -2604,7 +2604,7 @@
               <w:rPr>
                 <w:sz w:val="19"/>
               </w:rPr>
-              <w:t>1988 KB total</w:t>
+              <w:t>1991 KB total</w:t>
             </w:r>
           </w:p>
         </w:tc>
@@ -2618,7 +2618,7 @@
               <w:rPr>
                 <w:sz w:val="19"/>
               </w:rPr>
-              <w:t>0.69 ms median (training only)</w:t>
+              <w:t>0.68 ms median (training only)</w:t>
             </w:r>
           </w:p>
         </w:tc>
@@ -2732,7 +2732,7 @@
               <w:rPr>
                 <w:sz w:val="19"/>
               </w:rPr>
-              <w:t>0.46 ms</w:t>
+              <w:t>0.48 ms</w:t>
             </w:r>
           </w:p>
         </w:tc>
@@ -12895,7 +12895,37 @@
               <w:rPr>
                 <w:sz w:val="19"/>
               </w:rPr>
-              <w:t>Low, middle and high values: the real value should be below P10 1 time in 10 and above P90 1 time in 10.</w:t>
+              <w:t>Low, middle and high values: the real value should be below P10 1 time in 10 and above P90 1 time in 10 (the 80% range).</w:t>
+            </w:r>
+          </w:p>
+        </w:tc>
+      </w:tr>
+      <w:tr>
+        <w:tc>
+          <w:tcPr>
+            <w:tcW w:type="dxa" w:w="2268"/>
+          </w:tcPr>
+          <w:p>
+            <w:r/>
+            <w:r>
+              <w:rPr>
+                <w:sz w:val="19"/>
+              </w:rPr>
+              <w:t>P25, P75</w:t>
+            </w:r>
+          </w:p>
+        </w:tc>
+        <w:tc>
+          <w:tcPr>
+            <w:tcW w:type="dxa" w:w="6803"/>
+          </w:tcPr>
+          <w:p>
+            <w:r/>
+            <w:r>
+              <w:rPr>
+                <w:sz w:val="19"/>
+              </w:rPr>
+              <w:t>The shorter likely range shown to farmers (the 50% range): right about half the time.</w:t>
             </w:r>
           </w:p>
         </w:tc>

</xml_diff>